<commit_message>
New bits in setup
</commit_message>
<xml_diff>
--- a/docs/pipeline.docx
+++ b/docs/pipeline.docx
@@ -8,37 +8,6 @@
       </w:pPr>
       <w:r>
         <w:t xml:space="preserve">Pipeline</w:t>
-      </w:r>
-    </w:p>
-    <w:p>
-      <w:pPr>
-        <w:pStyle w:val="SourceCode"/>
-      </w:pPr>
-      <w:r>
-        <w:rPr>
-          <w:rStyle w:val="VerbatimChar"/>
-        </w:rPr>
-        <w:t xml:space="preserve">Checking on missing packages, installing if we need to. Starting timer...</w:t>
-      </w:r>
-    </w:p>
-    <w:p>
-      <w:pPr>
-        <w:pStyle w:val="SourceCode"/>
-      </w:pPr>
-      <w:r>
-        <w:rPr>
-          <w:rStyle w:val="VerbatimChar"/>
-        </w:rPr>
-        <w:t xml:space="preserve">Packages installed. Time taken:</w:t>
-      </w:r>
-      <w:r>
-        <w:br/>
-      </w:r>
-      <w:r>
-        <w:rPr>
-          <w:rStyle w:val="VerbatimChar"/>
-        </w:rPr>
-        <w:t xml:space="preserve">Time difference of 1.476925 secs</w:t>
       </w:r>
     </w:p>
     <w:bookmarkStart w:id="20" w:name="introduction"/>
@@ -83,7 +52,7 @@
       <w:r>
         <w:drawing>
           <wp:inline>
-            <wp:extent cx="5334000" cy="4267200"/>
+            <wp:extent cx="5334000" cy="3333750"/>
             <wp:effectExtent b="0" l="0" r="0" t="0"/>
             <wp:docPr descr="" title="" id="22" name="Picture"/>
             <a:graphic>
@@ -104,7 +73,7 @@
                   <pic:spPr bwMode="auto">
                     <a:xfrm>
                       <a:off x="0" y="0"/>
-                      <a:ext cx="5334000" cy="4267200"/>
+                      <a:ext cx="5334000" cy="3333750"/>
                     </a:xfrm>
                     <a:prstGeom prst="rect">
                       <a:avLst/>
@@ -140,7 +109,7 @@
       <w:r>
         <w:drawing>
           <wp:inline>
-            <wp:extent cx="5334000" cy="4267200"/>
+            <wp:extent cx="5334000" cy="3333750"/>
             <wp:effectExtent b="0" l="0" r="0" t="0"/>
             <wp:docPr descr="" title="" id="26" name="Picture"/>
             <a:graphic>
@@ -161,7 +130,7 @@
                   <pic:spPr bwMode="auto">
                     <a:xfrm>
                       <a:off x="0" y="0"/>
-                      <a:ext cx="5334000" cy="4267200"/>
+                      <a:ext cx="5334000" cy="3333750"/>
                     </a:xfrm>
                     <a:prstGeom prst="rect">
                       <a:avLst/>
@@ -180,7 +149,472 @@
         </w:drawing>
       </w:r>
     </w:p>
+    <w:p>
+      <w:pPr>
+        <w:pStyle w:val="BodyText"/>
+      </w:pPr>
+      <w:r>
+        <w:t xml:space="preserve">You can run code in the text too, to include dynamic values from the data, rather than handwriting those in. For instance, we can say that</w:t>
+      </w:r>
+      <w:r>
+        <w:t xml:space="preserve"> </w:t>
+      </w:r>
+      <w:r>
+        <w:rPr>
+          <w:b/>
+          <w:bCs/>
+        </w:rPr>
+        <w:t xml:space="preserve">the percent of Edinburgh’s finance jobs in 2024 was 14.5%.</w:t>
+      </w:r>
+    </w:p>
+    <w:p>
+      <w:pPr>
+        <w:pStyle w:val="BodyText"/>
+      </w:pPr>
+      <w:r>
+        <w:t xml:space="preserve">We can also add tables in from the data:</w:t>
+      </w:r>
+    </w:p>
+    <w:p>
+      <w:pPr>
+        <w:pStyle w:val="TableCaption"/>
+      </w:pPr>
+      <w:r>
+        <w:t xml:space="preserve">Table: core cities’ percent of finance jobs in 2024 (SICs 64-66)</w:t>
+      </w:r>
+    </w:p>
+    <w:tbl>
+      <w:tblPr>
+        <w:tblStyle w:val="Table"/>
+        <w:tblW w:type="auto" w:w="0"/>
+        <w:tblLook w:firstRow="1" w:lastRow="0" w:firstColumn="0" w:lastColumn="0" w:noHBand="0" w:noVBand="0" w:val="0020"/>
+        <w:tblCaption w:val="Table: core cities’ percent of finance jobs in 2024 (SICs 64-66)"/>
+      </w:tblPr>
+      <w:tblGrid>
+        <w:gridCol w:w="3960"/>
+        <w:gridCol w:w="3960"/>
+      </w:tblGrid>
+      <w:tr>
+        <w:trPr>
+          <w:tblHeader w:val="on"/>
+        </w:trPr>
+        <w:tc>
+          <w:tcPr/>
+          <w:p>
+            <w:pPr>
+              <w:pStyle w:val="Compact"/>
+              <w:jc w:val="left"/>
+            </w:pPr>
+            <w:r>
+              <w:t xml:space="preserve">City</w:t>
+            </w:r>
+          </w:p>
+        </w:tc>
+        <w:tc>
+          <w:tcPr/>
+          <w:p>
+            <w:pPr>
+              <w:pStyle w:val="Compact"/>
+              <w:jc w:val="right"/>
+            </w:pPr>
+            <w:r>
+              <w:t xml:space="preserve">percent</w:t>
+            </w:r>
+          </w:p>
+        </w:tc>
+      </w:tr>
+      <w:tr>
+        <w:tc>
+          <w:tcPr/>
+          <w:p>
+            <w:pPr>
+              <w:pStyle w:val="Compact"/>
+              <w:jc w:val="left"/>
+            </w:pPr>
+            <w:r>
+              <w:t xml:space="preserve">City of Edinburgh</w:t>
+            </w:r>
+          </w:p>
+        </w:tc>
+        <w:tc>
+          <w:tcPr/>
+          <w:p>
+            <w:pPr>
+              <w:pStyle w:val="Compact"/>
+              <w:jc w:val="right"/>
+            </w:pPr>
+            <w:r>
+              <w:t xml:space="preserve">14.5</w:t>
+            </w:r>
+          </w:p>
+        </w:tc>
+      </w:tr>
+      <w:tr>
+        <w:tc>
+          <w:tcPr/>
+          <w:p>
+            <w:pPr>
+              <w:pStyle w:val="Compact"/>
+              <w:jc w:val="left"/>
+            </w:pPr>
+            <w:r>
+              <w:t xml:space="preserve">Cardiff</w:t>
+            </w:r>
+          </w:p>
+        </w:tc>
+        <w:tc>
+          <w:tcPr/>
+          <w:p>
+            <w:pPr>
+              <w:pStyle w:val="Compact"/>
+              <w:jc w:val="right"/>
+            </w:pPr>
+            <w:r>
+              <w:t xml:space="preserve">9.6</w:t>
+            </w:r>
+          </w:p>
+        </w:tc>
+      </w:tr>
+      <w:tr>
+        <w:tc>
+          <w:tcPr/>
+          <w:p>
+            <w:pPr>
+              <w:pStyle w:val="Compact"/>
+              <w:jc w:val="left"/>
+            </w:pPr>
+            <w:r>
+              <w:t xml:space="preserve">Bristol, City of</w:t>
+            </w:r>
+          </w:p>
+        </w:tc>
+        <w:tc>
+          <w:tcPr/>
+          <w:p>
+            <w:pPr>
+              <w:pStyle w:val="Compact"/>
+              <w:jc w:val="right"/>
+            </w:pPr>
+            <w:r>
+              <w:t xml:space="preserve">7.6</w:t>
+            </w:r>
+          </w:p>
+        </w:tc>
+      </w:tr>
+      <w:tr>
+        <w:tc>
+          <w:tcPr/>
+          <w:p>
+            <w:pPr>
+              <w:pStyle w:val="Compact"/>
+              <w:jc w:val="left"/>
+            </w:pPr>
+            <w:r>
+              <w:t xml:space="preserve">Glasgow City</w:t>
+            </w:r>
+          </w:p>
+        </w:tc>
+        <w:tc>
+          <w:tcPr/>
+          <w:p>
+            <w:pPr>
+              <w:pStyle w:val="Compact"/>
+              <w:jc w:val="right"/>
+            </w:pPr>
+            <w:r>
+              <w:t xml:space="preserve">7.1</w:t>
+            </w:r>
+          </w:p>
+        </w:tc>
+      </w:tr>
+      <w:tr>
+        <w:tc>
+          <w:tcPr/>
+          <w:p>
+            <w:pPr>
+              <w:pStyle w:val="Compact"/>
+              <w:jc w:val="left"/>
+            </w:pPr>
+            <w:r>
+              <w:t xml:space="preserve">Manchester</w:t>
+            </w:r>
+          </w:p>
+        </w:tc>
+        <w:tc>
+          <w:tcPr/>
+          <w:p>
+            <w:pPr>
+              <w:pStyle w:val="Compact"/>
+              <w:jc w:val="right"/>
+            </w:pPr>
+            <w:r>
+              <w:t xml:space="preserve">7.0</w:t>
+            </w:r>
+          </w:p>
+        </w:tc>
+      </w:tr>
+      <w:tr>
+        <w:tc>
+          <w:tcPr/>
+          <w:p>
+            <w:pPr>
+              <w:pStyle w:val="Compact"/>
+              <w:jc w:val="left"/>
+            </w:pPr>
+            <w:r>
+              <w:t xml:space="preserve">Leeds</w:t>
+            </w:r>
+          </w:p>
+        </w:tc>
+        <w:tc>
+          <w:tcPr/>
+          <w:p>
+            <w:pPr>
+              <w:pStyle w:val="Compact"/>
+              <w:jc w:val="right"/>
+            </w:pPr>
+            <w:r>
+              <w:t xml:space="preserve">6.0</w:t>
+            </w:r>
+          </w:p>
+        </w:tc>
+      </w:tr>
+      <w:tr>
+        <w:tc>
+          <w:tcPr/>
+          <w:p>
+            <w:pPr>
+              <w:pStyle w:val="Compact"/>
+              <w:jc w:val="left"/>
+            </w:pPr>
+            <w:r>
+              <w:t xml:space="preserve">Birmingham</w:t>
+            </w:r>
+          </w:p>
+        </w:tc>
+        <w:tc>
+          <w:tcPr/>
+          <w:p>
+            <w:pPr>
+              <w:pStyle w:val="Compact"/>
+              <w:jc w:val="right"/>
+            </w:pPr>
+            <w:r>
+              <w:t xml:space="preserve">5.1</w:t>
+            </w:r>
+          </w:p>
+        </w:tc>
+      </w:tr>
+      <w:tr>
+        <w:tc>
+          <w:tcPr/>
+          <w:p>
+            <w:pPr>
+              <w:pStyle w:val="Compact"/>
+              <w:jc w:val="left"/>
+            </w:pPr>
+            <w:r>
+              <w:t xml:space="preserve">Liverpool</w:t>
+            </w:r>
+          </w:p>
+        </w:tc>
+        <w:tc>
+          <w:tcPr/>
+          <w:p>
+            <w:pPr>
+              <w:pStyle w:val="Compact"/>
+              <w:jc w:val="right"/>
+            </w:pPr>
+            <w:r>
+              <w:t xml:space="preserve">4.8</w:t>
+            </w:r>
+          </w:p>
+        </w:tc>
+      </w:tr>
+      <w:tr>
+        <w:tc>
+          <w:tcPr/>
+          <w:p>
+            <w:pPr>
+              <w:pStyle w:val="Compact"/>
+              <w:jc w:val="left"/>
+            </w:pPr>
+            <w:r>
+              <w:t xml:space="preserve">Sheffield</w:t>
+            </w:r>
+          </w:p>
+        </w:tc>
+        <w:tc>
+          <w:tcPr/>
+          <w:p>
+            <w:pPr>
+              <w:pStyle w:val="Compact"/>
+              <w:jc w:val="right"/>
+            </w:pPr>
+            <w:r>
+              <w:t xml:space="preserve">4.4</w:t>
+            </w:r>
+          </w:p>
+        </w:tc>
+      </w:tr>
+      <w:tr>
+        <w:tc>
+          <w:tcPr/>
+          <w:p>
+            <w:pPr>
+              <w:pStyle w:val="Compact"/>
+              <w:jc w:val="left"/>
+            </w:pPr>
+            <w:r>
+              <w:t xml:space="preserve">Newcastle upon Tyne</w:t>
+            </w:r>
+          </w:p>
+        </w:tc>
+        <w:tc>
+          <w:tcPr/>
+          <w:p>
+            <w:pPr>
+              <w:pStyle w:val="Compact"/>
+              <w:jc w:val="right"/>
+            </w:pPr>
+            <w:r>
+              <w:t xml:space="preserve">3.8</w:t>
+            </w:r>
+          </w:p>
+        </w:tc>
+      </w:tr>
+      <w:tr>
+        <w:tc>
+          <w:tcPr/>
+          <w:p>
+            <w:pPr>
+              <w:pStyle w:val="Compact"/>
+              <w:jc w:val="left"/>
+            </w:pPr>
+            <w:r>
+              <w:t xml:space="preserve">Nottingham</w:t>
+            </w:r>
+          </w:p>
+        </w:tc>
+        <w:tc>
+          <w:tcPr/>
+          <w:p>
+            <w:pPr>
+              <w:pStyle w:val="Compact"/>
+              <w:jc w:val="right"/>
+            </w:pPr>
+            <w:r>
+              <w:t xml:space="preserve">2.8</w:t>
+            </w:r>
+          </w:p>
+        </w:tc>
+      </w:tr>
+    </w:tbl>
     <w:bookmarkEnd w:id="28"/>
+    <w:bookmarkStart w:id="35" w:name="X455b717baa5174ea599ec41cb939ec80f91606b"/>
+    <w:p>
+      <w:pPr>
+        <w:pStyle w:val="Heading2"/>
+      </w:pPr>
+      <w:r>
+        <w:t xml:space="preserve">3. Scraping websites for links, downloading one and extracting from a zip</w:t>
+      </w:r>
+    </w:p>
+    <w:p>
+      <w:pPr>
+        <w:pStyle w:val="FirstParagraph"/>
+      </w:pPr>
+      <w:r>
+        <w:drawing>
+          <wp:inline>
+            <wp:extent cx="5334000" cy="3333750"/>
+            <wp:effectExtent b="0" l="0" r="0" t="0"/>
+            <wp:docPr descr="" title="" id="30" name="Picture"/>
+            <a:graphic>
+              <a:graphicData uri="http://schemas.openxmlformats.org/drawingml/2006/picture">
+                <pic:pic>
+                  <pic:nvPicPr>
+                    <pic:cNvPr descr="pipeline_files/figure-docx/scraping_census-1.png" id="31" name="Picture"/>
+                    <pic:cNvPicPr>
+                      <a:picLocks noChangeArrowheads="1" noChangeAspect="1"/>
+                    </pic:cNvPicPr>
+                  </pic:nvPicPr>
+                  <pic:blipFill>
+                    <a:blip r:embed="rId29"/>
+                    <a:stretch>
+                      <a:fillRect/>
+                    </a:stretch>
+                  </pic:blipFill>
+                  <pic:spPr bwMode="auto">
+                    <a:xfrm>
+                      <a:off x="0" y="0"/>
+                      <a:ext cx="5334000" cy="3333750"/>
+                    </a:xfrm>
+                    <a:prstGeom prst="rect">
+                      <a:avLst/>
+                    </a:prstGeom>
+                    <a:noFill/>
+                    <a:ln w="9525">
+                      <a:noFill/>
+                      <a:headEnd/>
+                      <a:tailEnd/>
+                    </a:ln>
+                  </pic:spPr>
+                </pic:pic>
+              </a:graphicData>
+            </a:graphic>
+          </wp:inline>
+        </w:drawing>
+      </w:r>
+    </w:p>
+    <w:p>
+      <w:pPr>
+        <w:pStyle w:val="BodyText"/>
+      </w:pPr>
+      <w:r>
+        <w:drawing>
+          <wp:inline>
+            <wp:extent cx="5334000" cy="3333750"/>
+            <wp:effectExtent b="0" l="0" r="0" t="0"/>
+            <wp:docPr descr="" title="" id="33" name="Picture"/>
+            <a:graphic>
+              <a:graphicData uri="http://schemas.openxmlformats.org/drawingml/2006/picture">
+                <pic:pic>
+                  <pic:nvPicPr>
+                    <pic:cNvPr descr="pipeline_files/figure-docx/census2-1.png" id="34" name="Picture"/>
+                    <pic:cNvPicPr>
+                      <a:picLocks noChangeArrowheads="1" noChangeAspect="1"/>
+                    </pic:cNvPicPr>
+                  </pic:nvPicPr>
+                  <pic:blipFill>
+                    <a:blip r:embed="rId32"/>
+                    <a:stretch>
+                      <a:fillRect/>
+                    </a:stretch>
+                  </pic:blipFill>
+                  <pic:spPr bwMode="auto">
+                    <a:xfrm>
+                      <a:off x="0" y="0"/>
+                      <a:ext cx="5334000" cy="3333750"/>
+                    </a:xfrm>
+                    <a:prstGeom prst="rect">
+                      <a:avLst/>
+                    </a:prstGeom>
+                    <a:noFill/>
+                    <a:ln w="9525">
+                      <a:noFill/>
+                      <a:headEnd/>
+                      <a:tailEnd/>
+                    </a:ln>
+                  </pic:spPr>
+                </pic:pic>
+              </a:graphicData>
+            </a:graphic>
+          </wp:inline>
+        </w:drawing>
+      </w:r>
+    </w:p>
+    <w:bookmarkEnd w:id="35"/>
     <w:sectPr>
       <w:footnotePr>
         <w:numRestart w:val="eachSect"/>

</xml_diff>

<commit_message>
Pipeline slides draft 1
</commit_message>
<xml_diff>
--- a/docs/pipeline.docx
+++ b/docs/pipeline.docx
@@ -525,6 +525,14 @@
         <w:pStyle w:val="FirstParagraph"/>
       </w:pPr>
       <w:r>
+        <w:t xml:space="preserve">First we look at occupation percents in England/Wales core cities.</w:t>
+      </w:r>
+    </w:p>
+    <w:p>
+      <w:pPr>
+        <w:pStyle w:val="BodyText"/>
+      </w:pPr>
+      <w:r>
         <w:drawing>
           <wp:inline>
             <wp:extent cx="5334000" cy="3333750"/>
@@ -572,6 +580,14 @@
         <w:pStyle w:val="BodyText"/>
       </w:pPr>
       <w:r>
+        <w:t xml:space="preserve">But how do those compare to average?</w:t>
+      </w:r>
+    </w:p>
+    <w:p>
+      <w:pPr>
+        <w:pStyle w:val="BodyText"/>
+      </w:pPr>
+      <w:r>
         <w:drawing>
           <wp:inline>
             <wp:extent cx="5334000" cy="3333750"/>
@@ -615,6 +631,102 @@
       </w:r>
     </w:p>
     <w:bookmarkEnd w:id="35"/>
+    <w:bookmarkStart w:id="38" w:name="ok-were-done"/>
+    <w:p>
+      <w:pPr>
+        <w:pStyle w:val="Heading1"/>
+      </w:pPr>
+      <w:r>
+        <w:t xml:space="preserve">OK, we’re done</w:t>
+      </w:r>
+    </w:p>
+    <w:p>
+      <w:r>
+        <w:pict>
+          <v:rect style="width:0;height:1.5pt" o:hralign="center" o:hrstd="t" o:hr="t"/>
+        </w:pict>
+      </w:r>
+    </w:p>
+    <w:bookmarkStart w:id="37" w:name="X978aa0d6f5cc3e5c4ecdfcc8b820059edb7832b"/>
+    <w:p>
+      <w:pPr>
+        <w:pStyle w:val="Heading2"/>
+      </w:pPr>
+      <w:r>
+        <w:t xml:space="preserve">Hopefully some of that worked or made sense</w:t>
+      </w:r>
+    </w:p>
+    <w:p>
+      <w:pPr>
+        <w:pStyle w:val="Compact"/>
+        <w:numPr>
+          <w:ilvl w:val="0"/>
+          <w:numId w:val="1001"/>
+        </w:numPr>
+      </w:pPr>
+      <w:r>
+        <w:t xml:space="preserve">If the final output didn’t work, for some reason, there’s a</w:t>
+      </w:r>
+      <w:r>
+        <w:t xml:space="preserve"> </w:t>
+      </w:r>
+      <w:hyperlink r:id="rId36">
+        <w:r>
+          <w:rPr>
+            <w:rStyle w:val="Hyperlink"/>
+          </w:rPr>
+          <w:t xml:space="preserve">version to download here</w:t>
+        </w:r>
+      </w:hyperlink>
+      <w:r>
+        <w:t xml:space="preserve"> </w:t>
+      </w:r>
+      <w:r>
+        <w:t xml:space="preserve">to have a look at what it</w:t>
+      </w:r>
+      <w:r>
+        <w:t xml:space="preserve"> </w:t>
+      </w:r>
+      <w:r>
+        <w:rPr>
+          <w:i/>
+          <w:iCs/>
+        </w:rPr>
+        <w:t xml:space="preserve">should in theory</w:t>
+      </w:r>
+      <w:r>
+        <w:t xml:space="preserve"> </w:t>
+      </w:r>
+      <w:r>
+        <w:t xml:space="preserve">have done!</w:t>
+      </w:r>
+    </w:p>
+    <w:p>
+      <w:pPr>
+        <w:pStyle w:val="Compact"/>
+        <w:numPr>
+          <w:ilvl w:val="0"/>
+          <w:numId w:val="1001"/>
+        </w:numPr>
+      </w:pPr>
+      <w:r>
+        <w:t xml:space="preserve">Would a workshop on any of this stuff might be of interest?</w:t>
+      </w:r>
+    </w:p>
+    <w:p>
+      <w:pPr>
+        <w:pStyle w:val="Compact"/>
+        <w:numPr>
+          <w:ilvl w:val="0"/>
+          <w:numId w:val="1001"/>
+        </w:numPr>
+      </w:pPr>
+      <w:r>
+        <w:t xml:space="preserve">The next logical step is something on using github as the repository for open output…</w:t>
+      </w:r>
+    </w:p>
+    <w:bookmarkEnd w:id="37"/>
+    <w:bookmarkEnd w:id="38"/>
     <w:sectPr>
       <w:footnotePr>
         <w:numRestart w:val="eachSect"/>
@@ -725,8 +837,114 @@
       </w:pPr>
     </w:lvl>
   </w:abstractNum>
+  <w:abstractNum w:abstractNumId="991">
+    <w:nsid w:val="0000A991"/>
+    <w:multiLevelType w:val="multilevel"/>
+    <w:lvl w:ilvl="0">
+      <w:numFmt w:val="bullet"/>
+      <w:lvlText w:val=""/>
+      <w:lvlJc w:val="left"/>
+      <w:pPr>
+        <w:ind w:left="720" w:hanging="360"/>
+      </w:pPr>
+      <w:rPr>
+        <w:rFonts w:ascii="Symbol" w:hAnsi="Symbol" w:cs="Symbol" w:hint="default"/>
+      </w:rPr>
+    </w:lvl>
+    <w:lvl w:ilvl="1">
+      <w:numFmt w:val="bullet"/>
+      <w:lvlText w:val="o"/>
+      <w:lvlJc w:val="left"/>
+      <w:pPr>
+        <w:ind w:left="1440" w:hanging="360"/>
+      </w:pPr>
+      <w:rPr>
+        <w:rFonts w:ascii="Courier New" w:hAnsi="Courier New" w:cs="Courier New" w:hint="default"/>
+      </w:rPr>
+    </w:lvl>
+    <w:lvl w:ilvl="2">
+      <w:numFmt w:val="bullet"/>
+      <w:lvlText w:val=""/>
+      <w:lvlJc w:val="left"/>
+      <w:pPr>
+        <w:ind w:left="2160" w:hanging="360"/>
+      </w:pPr>
+      <w:rPr>
+        <w:rFonts w:ascii="Wingdings" w:hAnsi="Wingdings" w:cs="Wingdings" w:hint="default"/>
+      </w:rPr>
+    </w:lvl>
+    <w:lvl w:ilvl="3">
+      <w:numFmt w:val="bullet"/>
+      <w:lvlText w:val=""/>
+      <w:lvlJc w:val="left"/>
+      <w:pPr>
+        <w:ind w:left="2880" w:hanging="360"/>
+      </w:pPr>
+      <w:rPr>
+        <w:rFonts w:ascii="Symbol" w:hAnsi="Symbol" w:cs="Symbol" w:hint="default"/>
+      </w:rPr>
+    </w:lvl>
+    <w:lvl w:ilvl="4">
+      <w:numFmt w:val="bullet"/>
+      <w:lvlText w:val="o"/>
+      <w:lvlJc w:val="left"/>
+      <w:pPr>
+        <w:ind w:left="3600" w:hanging="360"/>
+      </w:pPr>
+      <w:rPr>
+        <w:rFonts w:ascii="Courier New" w:hAnsi="Courier New" w:cs="Courier New" w:hint="default"/>
+      </w:rPr>
+    </w:lvl>
+    <w:lvl w:ilvl="5">
+      <w:numFmt w:val="bullet"/>
+      <w:lvlText w:val=""/>
+      <w:lvlJc w:val="left"/>
+      <w:pPr>
+        <w:ind w:left="4320" w:hanging="360"/>
+      </w:pPr>
+      <w:rPr>
+        <w:rFonts w:ascii="Wingdings" w:hAnsi="Wingdings" w:cs="Wingdings" w:hint="default"/>
+      </w:rPr>
+    </w:lvl>
+    <w:lvl w:ilvl="6">
+      <w:numFmt w:val="bullet"/>
+      <w:lvlText w:val=""/>
+      <w:lvlJc w:val="left"/>
+      <w:pPr>
+        <w:ind w:left="5040" w:hanging="360"/>
+      </w:pPr>
+      <w:rPr>
+        <w:rFonts w:ascii="Symbol" w:hAnsi="Symbol" w:cs="Symbol" w:hint="default"/>
+      </w:rPr>
+    </w:lvl>
+    <w:lvl w:ilvl="7">
+      <w:numFmt w:val="bullet"/>
+      <w:lvlText w:val="o"/>
+      <w:lvlJc w:val="left"/>
+      <w:pPr>
+        <w:ind w:left="5760" w:hanging="360"/>
+      </w:pPr>
+      <w:rPr>
+        <w:rFonts w:ascii="Courier New" w:hAnsi="Courier New" w:cs="Courier New" w:hint="default"/>
+      </w:rPr>
+    </w:lvl>
+    <w:lvl w:ilvl="8">
+      <w:numFmt w:val="bullet"/>
+      <w:lvlText w:val=""/>
+      <w:lvlJc w:val="left"/>
+      <w:pPr>
+        <w:ind w:left="6480" w:hanging="360"/>
+      </w:pPr>
+      <w:rPr>
+        <w:rFonts w:ascii="Wingdings" w:hAnsi="Wingdings" w:cs="Wingdings" w:hint="default"/>
+      </w:rPr>
+    </w:lvl>
+  </w:abstractNum>
   <w:num w:numId="1000">
     <w:abstractNumId w:val="990"/>
+  </w:num>
+  <w:num w:numId="1001">
+    <w:abstractNumId w:val="991"/>
   </w:num>
 </w:numbering>
 </file>

</xml_diff>

<commit_message>
Pipeline  qmd complete version
</commit_message>
<xml_diff>
--- a/docs/pipeline.docx
+++ b/docs/pipeline.docx
@@ -172,7 +172,7 @@
         <w:pStyle w:val="BodyText"/>
       </w:pPr>
       <w:r>
-        <w:t xml:space="preserve">We can also add tables in from the data:</w:t>
+        <w:t xml:space="preserve">Also - table of percentages in order:</w:t>
       </w:r>
     </w:p>
     <w:p>
@@ -631,102 +631,6 @@
       </w:r>
     </w:p>
     <w:bookmarkEnd w:id="35"/>
-    <w:bookmarkStart w:id="38" w:name="ok-were-done"/>
-    <w:p>
-      <w:pPr>
-        <w:pStyle w:val="Heading1"/>
-      </w:pPr>
-      <w:r>
-        <w:t xml:space="preserve">OK, we’re done</w:t>
-      </w:r>
-    </w:p>
-    <w:p>
-      <w:r>
-        <w:pict>
-          <v:rect style="width:0;height:1.5pt" o:hralign="center" o:hrstd="t" o:hr="t"/>
-        </w:pict>
-      </w:r>
-    </w:p>
-    <w:bookmarkStart w:id="37" w:name="X978aa0d6f5cc3e5c4ecdfcc8b820059edb7832b"/>
-    <w:p>
-      <w:pPr>
-        <w:pStyle w:val="Heading2"/>
-      </w:pPr>
-      <w:r>
-        <w:t xml:space="preserve">Hopefully some of that worked or made sense</w:t>
-      </w:r>
-    </w:p>
-    <w:p>
-      <w:pPr>
-        <w:pStyle w:val="Compact"/>
-        <w:numPr>
-          <w:ilvl w:val="0"/>
-          <w:numId w:val="1001"/>
-        </w:numPr>
-      </w:pPr>
-      <w:r>
-        <w:t xml:space="preserve">If the final output didn’t work, for some reason, there’s a</w:t>
-      </w:r>
-      <w:r>
-        <w:t xml:space="preserve"> </w:t>
-      </w:r>
-      <w:hyperlink r:id="rId36">
-        <w:r>
-          <w:rPr>
-            <w:rStyle w:val="Hyperlink"/>
-          </w:rPr>
-          <w:t xml:space="preserve">version to download here</w:t>
-        </w:r>
-      </w:hyperlink>
-      <w:r>
-        <w:t xml:space="preserve"> </w:t>
-      </w:r>
-      <w:r>
-        <w:t xml:space="preserve">to have a look at what it</w:t>
-      </w:r>
-      <w:r>
-        <w:t xml:space="preserve"> </w:t>
-      </w:r>
-      <w:r>
-        <w:rPr>
-          <w:i/>
-          <w:iCs/>
-        </w:rPr>
-        <w:t xml:space="preserve">should in theory</w:t>
-      </w:r>
-      <w:r>
-        <w:t xml:space="preserve"> </w:t>
-      </w:r>
-      <w:r>
-        <w:t xml:space="preserve">have done!</w:t>
-      </w:r>
-    </w:p>
-    <w:p>
-      <w:pPr>
-        <w:pStyle w:val="Compact"/>
-        <w:numPr>
-          <w:ilvl w:val="0"/>
-          <w:numId w:val="1001"/>
-        </w:numPr>
-      </w:pPr>
-      <w:r>
-        <w:t xml:space="preserve">Would a workshop on any of this stuff might be of interest?</w:t>
-      </w:r>
-    </w:p>
-    <w:p>
-      <w:pPr>
-        <w:pStyle w:val="Compact"/>
-        <w:numPr>
-          <w:ilvl w:val="0"/>
-          <w:numId w:val="1001"/>
-        </w:numPr>
-      </w:pPr>
-      <w:r>
-        <w:t xml:space="preserve">The next logical step is something on using github as the repository for open output…</w:t>
-      </w:r>
-    </w:p>
-    <w:bookmarkEnd w:id="37"/>
-    <w:bookmarkEnd w:id="38"/>
     <w:sectPr>
       <w:footnotePr>
         <w:numRestart w:val="eachSect"/>
@@ -837,114 +741,8 @@
       </w:pPr>
     </w:lvl>
   </w:abstractNum>
-  <w:abstractNum w:abstractNumId="991">
-    <w:nsid w:val="0000A991"/>
-    <w:multiLevelType w:val="multilevel"/>
-    <w:lvl w:ilvl="0">
-      <w:numFmt w:val="bullet"/>
-      <w:lvlText w:val=""/>
-      <w:lvlJc w:val="left"/>
-      <w:pPr>
-        <w:ind w:left="720" w:hanging="360"/>
-      </w:pPr>
-      <w:rPr>
-        <w:rFonts w:ascii="Symbol" w:hAnsi="Symbol" w:cs="Symbol" w:hint="default"/>
-      </w:rPr>
-    </w:lvl>
-    <w:lvl w:ilvl="1">
-      <w:numFmt w:val="bullet"/>
-      <w:lvlText w:val="o"/>
-      <w:lvlJc w:val="left"/>
-      <w:pPr>
-        <w:ind w:left="1440" w:hanging="360"/>
-      </w:pPr>
-      <w:rPr>
-        <w:rFonts w:ascii="Courier New" w:hAnsi="Courier New" w:cs="Courier New" w:hint="default"/>
-      </w:rPr>
-    </w:lvl>
-    <w:lvl w:ilvl="2">
-      <w:numFmt w:val="bullet"/>
-      <w:lvlText w:val=""/>
-      <w:lvlJc w:val="left"/>
-      <w:pPr>
-        <w:ind w:left="2160" w:hanging="360"/>
-      </w:pPr>
-      <w:rPr>
-        <w:rFonts w:ascii="Wingdings" w:hAnsi="Wingdings" w:cs="Wingdings" w:hint="default"/>
-      </w:rPr>
-    </w:lvl>
-    <w:lvl w:ilvl="3">
-      <w:numFmt w:val="bullet"/>
-      <w:lvlText w:val=""/>
-      <w:lvlJc w:val="left"/>
-      <w:pPr>
-        <w:ind w:left="2880" w:hanging="360"/>
-      </w:pPr>
-      <w:rPr>
-        <w:rFonts w:ascii="Symbol" w:hAnsi="Symbol" w:cs="Symbol" w:hint="default"/>
-      </w:rPr>
-    </w:lvl>
-    <w:lvl w:ilvl="4">
-      <w:numFmt w:val="bullet"/>
-      <w:lvlText w:val="o"/>
-      <w:lvlJc w:val="left"/>
-      <w:pPr>
-        <w:ind w:left="3600" w:hanging="360"/>
-      </w:pPr>
-      <w:rPr>
-        <w:rFonts w:ascii="Courier New" w:hAnsi="Courier New" w:cs="Courier New" w:hint="default"/>
-      </w:rPr>
-    </w:lvl>
-    <w:lvl w:ilvl="5">
-      <w:numFmt w:val="bullet"/>
-      <w:lvlText w:val=""/>
-      <w:lvlJc w:val="left"/>
-      <w:pPr>
-        <w:ind w:left="4320" w:hanging="360"/>
-      </w:pPr>
-      <w:rPr>
-        <w:rFonts w:ascii="Wingdings" w:hAnsi="Wingdings" w:cs="Wingdings" w:hint="default"/>
-      </w:rPr>
-    </w:lvl>
-    <w:lvl w:ilvl="6">
-      <w:numFmt w:val="bullet"/>
-      <w:lvlText w:val=""/>
-      <w:lvlJc w:val="left"/>
-      <w:pPr>
-        <w:ind w:left="5040" w:hanging="360"/>
-      </w:pPr>
-      <w:rPr>
-        <w:rFonts w:ascii="Symbol" w:hAnsi="Symbol" w:cs="Symbol" w:hint="default"/>
-      </w:rPr>
-    </w:lvl>
-    <w:lvl w:ilvl="7">
-      <w:numFmt w:val="bullet"/>
-      <w:lvlText w:val="o"/>
-      <w:lvlJc w:val="left"/>
-      <w:pPr>
-        <w:ind w:left="5760" w:hanging="360"/>
-      </w:pPr>
-      <w:rPr>
-        <w:rFonts w:ascii="Courier New" w:hAnsi="Courier New" w:cs="Courier New" w:hint="default"/>
-      </w:rPr>
-    </w:lvl>
-    <w:lvl w:ilvl="8">
-      <w:numFmt w:val="bullet"/>
-      <w:lvlText w:val=""/>
-      <w:lvlJc w:val="left"/>
-      <w:pPr>
-        <w:ind w:left="6480" w:hanging="360"/>
-      </w:pPr>
-      <w:rPr>
-        <w:rFonts w:ascii="Wingdings" w:hAnsi="Wingdings" w:cs="Wingdings" w:hint="default"/>
-      </w:rPr>
-    </w:lvl>
-  </w:abstractNum>
   <w:num w:numId="1000">
     <w:abstractNumId w:val="990"/>
-  </w:num>
-  <w:num w:numId="1001">
-    <w:abstractNumId w:val="991"/>
   </w:num>
 </w:numbering>
 </file>

</xml_diff>